<commit_message>
Adiciona contrato e briefing do Plano Crescimento com condição de primeira compra
Co-Authored-By: Claude Opus 5.5 <noreply@anthropic.com>
Claude-Session: https://claude.ai/code/session_01SSsGQ7eaL5NEhgBCfBotZy
</commit_message>
<xml_diff>
--- a/propostas/contratos/contrato-plano-autoridade.docx
+++ b/propostas/contratos/contrato-plano-autoridade.docx
@@ -428,7 +428,7 @@
         <w:rPr>
           <w:b w:val="0"/>
         </w:rPr>
-        <w:t xml:space="preserve"> para agendá-los e iniciar o trabalho no perfil do CONTRATANTE, com postagens todos os dias.</w:t>
+        <w:t xml:space="preserve"> para agendá-los e iniciar as postagens no perfil do CONTRATANTE.</w:t>
       </w:r>
     </w:p>
     <w:p>
@@ -606,7 +606,7 @@
         <w:rPr>
           <w:b w:val="0"/>
         </w:rPr>
-        <w:t>4.3. A verba de anúncios é de responsabilidade exclusiva do CONTRATANTE e não está incluída no valor do item 4.1.</w:t>
+        <w:t>4.3. A verba de anúncios é de responsabilidade exclusiva do CONTRATANTE e não está incluída nos valores desta cláusula.</w:t>
       </w:r>
     </w:p>
     <w:p>
@@ -672,7 +672,7 @@
         <w:rPr>
           <w:b w:val="0"/>
         </w:rPr>
-        <w:t>5.2. Ao fim do período, o contrato poderá ser renovado por igual período mediante novo pagamento, mantidas as mesmas condições, salvo nova negociação entre as partes.</w:t>
+        <w:t>5.2. Ao fim do período, o contrato poderá ser renovado por igual período mediante novo pagamento, mantidas as demais condições, salvo nova negociação entre as partes.</w:t>
       </w:r>
     </w:p>
     <w:p>

</xml_diff>